<commit_message>
update to Module 1 assignment 1.3 with github link
</commit_message>
<xml_diff>
--- a/module-1/bronson-module-1-3.html.docx
+++ b/module-1/bronson-module-1-3.html.docx
@@ -46,6 +46,19 @@
         <w:t>, 2026</w:t>
       </w:r>
     </w:p>
+    <w:p>
+      <w:proofErr w:type="spellStart"/>
+      <w:r>
+        <w:t>Github</w:t>
+      </w:r>
+      <w:proofErr w:type="spellEnd"/>
+      <w:r>
+        <w:t xml:space="preserve"> link : </w:t>
+      </w:r>
+      <w:r>
+        <w:t>https://github.com/Wendybronson/csd-340.git</w:t>
+      </w:r>
+    </w:p>
     <w:p/>
     <w:p>
       <w:pPr>
@@ -72,6 +85,9 @@
     </w:p>
     <w:p>
       <w:r>
+        <w:rPr>
+          <w:noProof/>
+        </w:rPr>
         <w:drawing>
           <wp:inline distT="0" distB="0" distL="0" distR="0" wp14:anchorId="40F99CC2" wp14:editId="66F36778">
             <wp:extent cx="5943600" cy="4824095"/>
@@ -141,6 +157,9 @@
     </w:p>
     <w:p>
       <w:r>
+        <w:rPr>
+          <w:noProof/>
+        </w:rPr>
         <w:drawing>
           <wp:inline distT="0" distB="0" distL="0" distR="0" wp14:anchorId="4CA15940" wp14:editId="0E0748C9">
             <wp:extent cx="5943600" cy="4229735"/>
@@ -205,6 +224,9 @@
     </w:p>
     <w:p>
       <w:r>
+        <w:rPr>
+          <w:noProof/>
+        </w:rPr>
         <w:drawing>
           <wp:inline distT="0" distB="0" distL="0" distR="0" wp14:anchorId="20FC82A9" wp14:editId="48DA4C0C">
             <wp:extent cx="5943600" cy="3794125"/>
@@ -267,6 +289,9 @@
     </w:p>
     <w:p>
       <w:r>
+        <w:rPr>
+          <w:noProof/>
+        </w:rPr>
         <w:drawing>
           <wp:inline distT="0" distB="0" distL="0" distR="0" wp14:anchorId="04248597" wp14:editId="3B78A9B3">
             <wp:extent cx="5943600" cy="2634615"/>

</xml_diff>